<commit_message>
Se elimina comentarios innecesarios y se y se corrige documento de contrato
</commit_message>
<xml_diff>
--- a/back/src/static/vinculado/CL - TERMINO INDEFINIDO.docx
+++ b/back/src/static/vinculado/CL - TERMINO INDEFINIDO.docx
@@ -1898,13 +1898,7 @@
               <w:rPr>
                 <w:sz w:val="20"/>
               </w:rPr>
-              <w:t>}}</w:t>
-            </w:r>
-            <w:r>
-              <w:rPr>
-                <w:sz w:val="20"/>
-              </w:rPr>
-              <w:t xml:space="preserve"> </w:t>
+              <w:t xml:space="preserve">}} </w:t>
             </w:r>
           </w:p>
           <w:p>
@@ -2417,13 +2411,7 @@
               <w:rPr>
                 <w:sz w:val="20"/>
               </w:rPr>
-              <w:t>,</w:t>
-            </w:r>
-            <w:r>
-              <w:rPr>
-                <w:sz w:val="20"/>
-              </w:rPr>
-              <w:t xml:space="preserve"> </w:t>
+              <w:t xml:space="preserve">, </w:t>
             </w:r>
             <w:r>
               <w:rPr>
@@ -22392,7 +22380,6 @@
         </w:rPr>
         <w:t xml:space="preserve"> </w:t>
       </w:r>
-      <w:proofErr w:type="gramStart"/>
       <w:r>
         <w:t>del</w:t>
       </w:r>
@@ -22403,11 +22390,7 @@
         <w:t xml:space="preserve"> </w:t>
       </w:r>
       <w:r>
-        <w:t>mismo</w:t>
-      </w:r>
-      <w:proofErr w:type="gramEnd"/>
-      <w:r>
-        <w:t>.</w:t>
+        <w:t>mismo.</w:t>
       </w:r>
       <w:r>
         <w:rPr>
@@ -24962,11 +24945,9 @@
         </w:rPr>
         <w:t xml:space="preserve"> </w:t>
       </w:r>
-      <w:proofErr w:type="gramStart"/>
       <w:r>
         <w:t>tanto</w:t>
       </w:r>
-      <w:proofErr w:type="gramEnd"/>
       <w:r>
         <w:rPr>
           <w:spacing w:val="58"/>
@@ -25211,15 +25192,7 @@
         <w:t xml:space="preserve"> </w:t>
       </w:r>
       <w:r>
-        <w:t xml:space="preserve">contratos y demás documentos a que tuvo acceso </w:t>
-      </w:r>
-      <w:proofErr w:type="gramStart"/>
-      <w:r>
-        <w:t>en razón de</w:t>
-      </w:r>
-      <w:proofErr w:type="gramEnd"/>
-      <w:r>
-        <w:t xml:space="preserve"> su cargo a </w:t>
+        <w:t xml:space="preserve">contratos y demás documentos a que tuvo acceso en razón de su cargo a </w:t>
       </w:r>
       <w:r>
         <w:rPr>
@@ -27647,13 +27620,8 @@
         <w:pStyle w:val="Textoindependiente"/>
         <w:ind w:right="134"/>
       </w:pPr>
-      <w:proofErr w:type="gramStart"/>
-      <w:r>
-        <w:t>privacidad respectivo</w:t>
-      </w:r>
-      <w:proofErr w:type="gramEnd"/>
-      <w:r>
-        <w:t xml:space="preserve"> y específicamente para dar cumplimiento al desarrollo de nuestro objeto social, según sea el caso. 2. </w:t>
+      <w:r>
+        <w:t xml:space="preserve">privacidad respectivo y específicamente para dar cumplimiento al desarrollo de nuestro objeto social, según sea el caso. 2. </w:t>
       </w:r>
       <w:r>
         <w:rPr>
@@ -31136,7 +31104,27 @@
           <w:b/>
           <w:sz w:val="20"/>
         </w:rPr>
-        <w:t xml:space="preserve"> TRABAJADOR (A)</w:t>
+        <w:t xml:space="preserve"> </w:t>
+      </w:r>
+    </w:p>
+    <w:p>
+      <w:pPr>
+        <w:tabs>
+          <w:tab w:val="left" w:pos="2835"/>
+        </w:tabs>
+        <w:spacing w:before="1"/>
+        <w:ind w:left="109" w:right="1420"/>
+        <w:rPr>
+          <w:b/>
+          <w:sz w:val="20"/>
+        </w:rPr>
+      </w:pPr>
+      <w:r>
+        <w:rPr>
+          <w:b/>
+          <w:sz w:val="20"/>
+        </w:rPr>
+        <w:t>TRABAJADOR (A)</w:t>
       </w:r>
     </w:p>
     <w:sectPr>

</xml_diff>

<commit_message>
Se actualiza el word de contratacion viculados
</commit_message>
<xml_diff>
--- a/back/src/static/vinculado/CL - TERMINO INDEFINIDO.docx
+++ b/back/src/static/vinculado/CL - TERMINO INDEFINIDO.docx
@@ -1129,7 +1129,7 @@
             </w:r>
             <w:r>
               <w:rPr>
-                <w:b/>
+                <w:bCs/>
                 <w:spacing w:val="-2"/>
                 <w:sz w:val="20"/>
               </w:rPr>
@@ -1138,7 +1138,7 @@
             <w:proofErr w:type="spellStart"/>
             <w:r>
               <w:rPr>
-                <w:b/>
+                <w:bCs/>
                 <w:spacing w:val="-2"/>
                 <w:sz w:val="20"/>
               </w:rPr>
@@ -1147,7 +1147,7 @@
             <w:proofErr w:type="spellEnd"/>
             <w:r>
               <w:rPr>
-                <w:b/>
+                <w:bCs/>
                 <w:spacing w:val="-2"/>
                 <w:sz w:val="20"/>
               </w:rPr>
@@ -1631,6 +1631,7 @@
               <w:ind w:left="64"/>
               <w:rPr>
                 <w:b/>
+                <w:spacing w:val="-2"/>
                 <w:sz w:val="20"/>
               </w:rPr>
             </w:pPr>
@@ -1656,6 +1657,14 @@
                 <w:sz w:val="20"/>
               </w:rPr>
               <w:t>INMEDIATO</w:t>
+            </w:r>
+            <w:r>
+              <w:rPr>
+                <w:b/>
+                <w:spacing w:val="-2"/>
+                <w:sz w:val="20"/>
+              </w:rPr>
+              <w:t xml:space="preserve"> </w:t>
             </w:r>
           </w:p>
         </w:tc>
@@ -22380,6 +22389,7 @@
         </w:rPr>
         <w:t xml:space="preserve"> </w:t>
       </w:r>
+      <w:proofErr w:type="gramStart"/>
       <w:r>
         <w:t>del</w:t>
       </w:r>
@@ -22390,7 +22400,11 @@
         <w:t xml:space="preserve"> </w:t>
       </w:r>
       <w:r>
-        <w:t>mismo.</w:t>
+        <w:t>mismo</w:t>
+      </w:r>
+      <w:proofErr w:type="gramEnd"/>
+      <w:r>
+        <w:t>.</w:t>
       </w:r>
       <w:r>
         <w:rPr>
@@ -24945,9 +24959,11 @@
         </w:rPr>
         <w:t xml:space="preserve"> </w:t>
       </w:r>
+      <w:proofErr w:type="gramStart"/>
       <w:r>
         <w:t>tanto</w:t>
       </w:r>
+      <w:proofErr w:type="gramEnd"/>
       <w:r>
         <w:rPr>
           <w:spacing w:val="58"/>
@@ -25192,7 +25208,15 @@
         <w:t xml:space="preserve"> </w:t>
       </w:r>
       <w:r>
-        <w:t xml:space="preserve">contratos y demás documentos a que tuvo acceso en razón de su cargo a </w:t>
+        <w:t xml:space="preserve">contratos y demás documentos a que tuvo acceso </w:t>
+      </w:r>
+      <w:proofErr w:type="gramStart"/>
+      <w:r>
+        <w:t>en razón de</w:t>
+      </w:r>
+      <w:proofErr w:type="gramEnd"/>
+      <w:r>
+        <w:t xml:space="preserve"> su cargo a </w:t>
       </w:r>
       <w:r>
         <w:rPr>
@@ -27620,8 +27644,13 @@
         <w:pStyle w:val="Textoindependiente"/>
         <w:ind w:right="134"/>
       </w:pPr>
-      <w:r>
-        <w:t xml:space="preserve">privacidad respectivo y específicamente para dar cumplimiento al desarrollo de nuestro objeto social, según sea el caso. 2. </w:t>
+      <w:proofErr w:type="gramStart"/>
+      <w:r>
+        <w:t>privacidad respectivo</w:t>
+      </w:r>
+      <w:proofErr w:type="gramEnd"/>
+      <w:r>
+        <w:t xml:space="preserve"> y específicamente para dar cumplimiento al desarrollo de nuestro objeto social, según sea el caso. 2. </w:t>
       </w:r>
       <w:r>
         <w:rPr>

</xml_diff>